<commit_message>
feat: actualizar interfaz y manuales del anotador
</commit_message>
<xml_diff>
--- a/docs/Manual_base_spans.docx
+++ b/docs/Manual_base_spans.docx
@@ -120,6 +120,24 @@
         <w:t>Lea primero la explicación de las dos capas y el recorrido completo de una nota. Durante la tarea, mantenga abiertas la guía rápida y los ejemplos. Los casos son sintéticos y enseñan el método; no constituyen reglas de expansión automática.</w:t>
       </w:r>
     </w:p>
+    <CT_P>
+      <w:pPr/>
+      <w:r>
+        <w:t>Para comprender cómo se construyen las reglas, qué diferencia hay entre reconocimiento de entidades, spans, normalización, mapeo clínico y preanotación, consulte Fundamentos metodológicos para anotadores SemantIAr.</w:t>
+      </w:r>
+    </CT_P>
+    <CT_P>
+      <w:pPr/>
+      <w:r>
+        <w:t>Para comprender cómo se construyen las reglas, qué diferencia hay entre reconocimiento de entidades, spans, normalización, mapeo clínico y preanotación, consulte Fundamentos metodológicos para anotadores SemantIAr.</w:t>
+      </w:r>
+    </CT_P>
+    <CT_P>
+      <w:pPr/>
+      <w:r>
+        <w:t>Para comprender cómo se construyen las reglas, qué diferencia hay entre reconocimiento de entidades, spans, normalización, mapeo clínico y preanotación, consulte Fundamentos metodológicos para anotadores SemantIAr.</w:t>
+      </w:r>
+    </CT_P>
     <w:tbl>
       <w:tblPr>
         <w:tblW w:w="9360" w:type="dxa"/>
@@ -4853,58 +4871,7 @@
     </w:p>
     <w:p>
       <w:r>
-        <w:t xml:space="preserve">Una </w:t>
-      </w:r>
-      <w:r>
-        <w:rPr>
-          <w:b/>
-        </w:rPr>
-        <w:t>selección textual</w:t>
-      </w:r>
-      <w:r>
-        <w:t xml:space="preserve">, también llamada </w:t>
-      </w:r>
-      <w:r>
-        <w:rPr>
-          <w:b/>
-        </w:rPr>
-        <w:t>span</w:t>
-      </w:r>
-      <w:r>
-        <w:t xml:space="preserve">, es el fragmento exacto y continuo de la nota que queda resaltado para sostener una anotación clínica. Es el lugar del texto al que queda unido el concepto. Por ejemplo, en </w:t>
-      </w:r>
-      <w:r>
-        <w:rPr>
-          <w:rFonts w:ascii="Consolas" w:hAnsi="Consolas"/>
-          <w:color w:val="6941A5"/>
-          <w:sz w:val="18"/>
-        </w:rPr>
-        <w:t>AP: ASMA</w:t>
-      </w:r>
-      <w:r>
-        <w:t xml:space="preserve">, la mención clínica es </w:t>
-      </w:r>
-      <w:r>
-        <w:rPr>
-          <w:rFonts w:ascii="Consolas" w:hAnsi="Consolas"/>
-          <w:color w:val="6941A5"/>
-          <w:sz w:val="18"/>
-        </w:rPr>
-        <w:t>ASMA</w:t>
-      </w:r>
-      <w:r>
-        <w:t xml:space="preserve">; </w:t>
-      </w:r>
-      <w:r>
-        <w:rPr>
-          <w:rFonts w:ascii="Consolas" w:hAnsi="Consolas"/>
-          <w:color w:val="6941A5"/>
-          <w:sz w:val="18"/>
-        </w:rPr>
-        <w:t>AP:</w:t>
-      </w:r>
-      <w:r>
-        <w:t xml:space="preserve"> se revisa aparte como forma breve y encabezado.</w:t>
+        <w:t>Una selección textual, también llamada span, es el fragmento exacto del texto que queda resaltado para sostener una anotación clínica. En el protocolo operativo actual, las selecciones son habitualmente continuas; las superposiciones se conservan solo cuando representan menciones distintas y defendibles. Es el lugar del texto al que queda unido el concepto. Por ejemplo, en AP: ASMA, la mención clínica es ASMA; AP: se revisa aparte como forma breve y encabezado.</w:t>
       </w:r>
     </w:p>
     <w:tbl>
@@ -5008,16 +4975,7 @@
         <w:pStyle w:val="Listaconvietas"/>
       </w:pPr>
       <w:r>
-        <w:t xml:space="preserve">Seleccione el </w:t>
-      </w:r>
-      <w:r>
-        <w:rPr>
-          <w:b/>
-        </w:rPr>
-        <w:t>menor tramo textual completo</w:t>
-      </w:r>
-      <w:r>
-        <w:t xml:space="preserve"> que expresa la mención clínica.</w:t>
+        <w:t>Seleccione la mínima mención suficiente que expresa el concepto según la regla del protocolo. No recorte ni amplíe el texto solo para hacer coincidir un concepto terminológico.</w:t>
       </w:r>
     </w:p>
     <w:p>
@@ -5041,7 +4999,7 @@
         <w:pStyle w:val="Listaconvietas"/>
       </w:pPr>
       <w:r>
-        <w:t>No cree varias selecciones anidadas para representar distintos niveles de detalle de una misma mención.</w:t>
+        <w:t>No cree varias selecciones superpuestas o anidadas solo para representar distintos niveles de detalle de una misma mención. Conserve dos selecciones únicamente cuando el protocolo las reconozca como menciones clínicas diferentes.</w:t>
       </w:r>
     </w:p>
     <w:p>

</xml_diff>

<commit_message>
feat: consolidar aplicación y manuales del anotador
Integra la interfaz Angular, los manuales consolidados y las mejoras de legibilidad. Se validó con 62 pruebas y no se incluyeron JSON ni corpus clínicos.
</commit_message>
<xml_diff>
--- a/docs/Manual_base_spans.docx
+++ b/docs/Manual_base_spans.docx
@@ -120,6 +120,24 @@
         <w:t>Lea primero la explicación de las dos capas y el recorrido completo de una nota. Durante la tarea, mantenga abiertas la guía rápida y los ejemplos. Los casos son sintéticos y enseñan el método; no constituyen reglas de expansión automática.</w:t>
       </w:r>
     </w:p>
+    <CT_P>
+      <w:pPr/>
+      <w:r>
+        <w:t>Para comprender cómo se construyen las reglas, qué diferencia hay entre reconocimiento de entidades, spans, normalización, mapeo clínico y preanotación, consulte Fundamentos metodológicos para anotadores SemantIAr.</w:t>
+      </w:r>
+    </CT_P>
+    <CT_P>
+      <w:pPr/>
+      <w:r>
+        <w:t>Para comprender cómo se construyen las reglas, qué diferencia hay entre reconocimiento de entidades, spans, normalización, mapeo clínico y preanotación, consulte Fundamentos metodológicos para anotadores SemantIAr.</w:t>
+      </w:r>
+    </CT_P>
+    <CT_P>
+      <w:pPr/>
+      <w:r>
+        <w:t>Para comprender cómo se construyen las reglas, qué diferencia hay entre reconocimiento de entidades, spans, normalización, mapeo clínico y preanotación, consulte Fundamentos metodológicos para anotadores SemantIAr.</w:t>
+      </w:r>
+    </CT_P>
     <w:tbl>
       <w:tblPr>
         <w:tblW w:w="9360" w:type="dxa"/>
@@ -4853,58 +4871,7 @@
     </w:p>
     <w:p>
       <w:r>
-        <w:t xml:space="preserve">Una </w:t>
-      </w:r>
-      <w:r>
-        <w:rPr>
-          <w:b/>
-        </w:rPr>
-        <w:t>selección textual</w:t>
-      </w:r>
-      <w:r>
-        <w:t xml:space="preserve">, también llamada </w:t>
-      </w:r>
-      <w:r>
-        <w:rPr>
-          <w:b/>
-        </w:rPr>
-        <w:t>span</w:t>
-      </w:r>
-      <w:r>
-        <w:t xml:space="preserve">, es el fragmento exacto y continuo de la nota que queda resaltado para sostener una anotación clínica. Es el lugar del texto al que queda unido el concepto. Por ejemplo, en </w:t>
-      </w:r>
-      <w:r>
-        <w:rPr>
-          <w:rFonts w:ascii="Consolas" w:hAnsi="Consolas"/>
-          <w:color w:val="6941A5"/>
-          <w:sz w:val="18"/>
-        </w:rPr>
-        <w:t>AP: ASMA</w:t>
-      </w:r>
-      <w:r>
-        <w:t xml:space="preserve">, la mención clínica es </w:t>
-      </w:r>
-      <w:r>
-        <w:rPr>
-          <w:rFonts w:ascii="Consolas" w:hAnsi="Consolas"/>
-          <w:color w:val="6941A5"/>
-          <w:sz w:val="18"/>
-        </w:rPr>
-        <w:t>ASMA</w:t>
-      </w:r>
-      <w:r>
-        <w:t xml:space="preserve">; </w:t>
-      </w:r>
-      <w:r>
-        <w:rPr>
-          <w:rFonts w:ascii="Consolas" w:hAnsi="Consolas"/>
-          <w:color w:val="6941A5"/>
-          <w:sz w:val="18"/>
-        </w:rPr>
-        <w:t>AP:</w:t>
-      </w:r>
-      <w:r>
-        <w:t xml:space="preserve"> se revisa aparte como forma breve y encabezado.</w:t>
+        <w:t>Una selección textual, también llamada span, es el fragmento exacto del texto que queda resaltado para sostener una anotación clínica. En el protocolo operativo actual, las selecciones son habitualmente continuas; las superposiciones se conservan solo cuando representan menciones distintas y defendibles. Es el lugar del texto al que queda unido el concepto. Por ejemplo, en AP: ASMA, la mención clínica es ASMA; AP: se revisa aparte como forma breve y encabezado.</w:t>
       </w:r>
     </w:p>
     <w:tbl>
@@ -5008,16 +4975,7 @@
         <w:pStyle w:val="Listaconvietas"/>
       </w:pPr>
       <w:r>
-        <w:t xml:space="preserve">Seleccione el </w:t>
-      </w:r>
-      <w:r>
-        <w:rPr>
-          <w:b/>
-        </w:rPr>
-        <w:t>menor tramo textual completo</w:t>
-      </w:r>
-      <w:r>
-        <w:t xml:space="preserve"> que expresa la mención clínica.</w:t>
+        <w:t>Seleccione la mínima mención suficiente que expresa el concepto según la regla del protocolo. No recorte ni amplíe el texto solo para hacer coincidir un concepto terminológico.</w:t>
       </w:r>
     </w:p>
     <w:p>
@@ -5041,7 +4999,7 @@
         <w:pStyle w:val="Listaconvietas"/>
       </w:pPr>
       <w:r>
-        <w:t>No cree varias selecciones anidadas para representar distintos niveles de detalle de una misma mención.</w:t>
+        <w:t>No cree varias selecciones superpuestas o anidadas solo para representar distintos niveles de detalle de una misma mención. Conserve dos selecciones únicamente cuando el protocolo las reconozca como menciones clínicas diferentes.</w:t>
       </w:r>
     </w:p>
     <w:p>

</xml_diff>

<commit_message>
Integrate unified annotation workflow and update manuals
</commit_message>
<xml_diff>
--- a/docs/Manual_base_spans.docx
+++ b/docs/Manual_base_spans.docx
@@ -117,9 +117,15 @@
     </w:p>
     <w:p>
       <w:r>
-        <w:t>Lea primero la explicación de las dos capas y el recorrido completo de una nota. Durante la tarea, mantenga abiertas la guía rápida y los ejemplos. Los casos son sintéticos y enseñan el método; no constituyen reglas de expansión automática.</w:t>
-      </w:r>
-    </w:p>
+        <w:t>Lea primero los fundamentos metodológicos de la versión 1.2 y luego siga el recorrido operativo en tres pasos: leer la nota, marcar las menciones pendientes y decidir cada aparición. Durante la tarea, mantenga abierta la guía rápida. Los casos son sintéticos y enseñan el método; no constituyen reglas de expansión automática.</w:t>
+      </w:r>
+    </w:p>
+    <CT_P>
+      <w:pPr/>
+      <w:r>
+        <w:t>Para comprender cómo se construyen las reglas, qué diferencia hay entre reconocimiento de entidades, spans, normalización, mapeo clínico y preanotación, consulte Fundamentos metodológicos para anotadores SemantIAr, versión 1.2 (9 de agosto de 2026).</w:t>
+      </w:r>
+    </CT_P>
     <CT_P>
       <w:pPr/>
       <w:r>
@@ -176,14 +182,7 @@
               <w:keepLines/>
             </w:pPr>
             <w:r>
-              <w:rPr>
-                <w:b/>
-                <w:color w:val="6941A5"/>
-              </w:rPr>
-              <w:t xml:space="preserve">En una frase. </w:t>
-            </w:r>
-            <w:r>
-              <w:t>Revise toda la nota, decida cada aparición con evidencia, anote por separado la forma léxica y el concepto clínico, y absténgase cuando el contexto no alcance.</w:t>
+              <w:t>En una frase. Revise toda la nota, marque cada aparición exacta y elija una clasificación unificada: término con información clínica, término sin información clínica, ambos o no anotar. Absténgase cuando el contexto no alcance y no cree una segunda marca para la misma aparición.</w:t>
             </w:r>
           </w:p>
         </w:tc>
@@ -408,30 +407,12 @@
         <w:pStyle w:val="Ttulo2"/>
       </w:pPr>
       <w:r>
-        <w:t>1.1 Léxico y clínico: dos preguntas diferentes</w:t>
-      </w:r>
-    </w:p>
-    <w:p>
-      <w:r>
-        <w:t xml:space="preserve">La aplicación separa dos tareas. La primera se refiere a la </w:t>
-      </w:r>
-      <w:r>
-        <w:rPr>
-          <w:b/>
-        </w:rPr>
-        <w:t>forma léxica</w:t>
-      </w:r>
-      <w:r>
-        <w:t xml:space="preserve">: qué significa una abreviatura, sigla o código en esa aparición. La segunda se refiere a la </w:t>
-      </w:r>
-      <w:r>
-        <w:rPr>
-          <w:b/>
-        </w:rPr>
-        <w:t>información clínica</w:t>
-      </w:r>
-      <w:r>
-        <w:t>: qué concepto expresa el fragmento y si corresponde normalizarlo con SNOMED CT.</w:t>
+        <w:t>1.1 Léxico, clínica y contexto: tres preguntas relacionadas</w:t>
+      </w:r>
+    </w:p>
+    <w:p>
+      <w:r>
+        <w:t>La aplicación conserva tres preguntas relacionadas. La primera se refiere a la forma léxica: cómo está escrita la expresión y qué significa en esa aparición. La segunda se refiere a la información clínica: qué concepto expresa el fragmento y si corresponde normalizarlo. La tercera describe el contexto: polaridad, certeza, temporalidad y sujeto. “Ambos” permite conservar las dos primeras dimensiones en una misma marca.</w:t>
       </w:r>
     </w:p>
     <w:p>
@@ -439,12 +420,7 @@
         <w:spacing w:before="100" w:after="80"/>
       </w:pPr>
       <w:r>
-        <w:rPr>
-          <w:b/>
-          <w:color w:val="5D6875"/>
-          <w:sz w:val="18"/>
-        </w:rPr>
-        <w:t>La misma porción de texto puede requerir dos anotaciones independientes.</w:t>
+        <w:t>La misma porción de texto puede conservar dos dimensiones en una misma marca.</w:t>
       </w:r>
     </w:p>
     <w:tbl>
@@ -509,11 +485,7 @@
               <w:pStyle w:val="TableText"/>
             </w:pPr>
             <w:r>
-              <w:rPr>
-                <w:b/>
-                <w:color w:val="2D3E5F"/>
-              </w:rPr>
-              <w:t>Qué se revisa en la capa léxica</w:t>
+              <w:t>Qué se revisa en la dimensión léxica</w:t>
             </w:r>
           </w:p>
         </w:tc>
@@ -528,11 +500,7 @@
               <w:pStyle w:val="TableText"/>
             </w:pPr>
             <w:r>
-              <w:rPr>
-                <w:b/>
-                <w:color w:val="2D3E5F"/>
-              </w:rPr>
-              <w:t>Qué se revisa en la capa clínica</w:t>
+              <w:t>Qué se revisa en la dimensión clínica y el contexto</w:t>
             </w:r>
           </w:p>
         </w:tc>
@@ -590,7 +558,7 @@
               <w:pStyle w:val="TableText"/>
             </w:pPr>
             <w:r>
-              <w:t>El valor se interpreta como hipertensión arterial y se registra como hallazgo clínico, de acuerdo con el criterio del protocolo.</w:t>
+              <w:t>La aparición registra el dato de tensión arterial con el valor 150/90 mmHg. No se infiere hipertensión arterial si la nota no lo afirma de manera explícita.</w:t>
             </w:r>
           </w:p>
         </w:tc>
@@ -768,52 +736,7 @@
               <w:keepLines/>
             </w:pPr>
             <w:r>
-              <w:rPr>
-                <w:b/>
-                <w:color w:val="9B5C00"/>
-              </w:rPr>
-              <w:t xml:space="preserve">No confundir expansión con concepto. </w:t>
-            </w:r>
-            <w:r>
-              <w:t xml:space="preserve">La </w:t>
-            </w:r>
-            <w:r>
-              <w:rPr>
-                <w:b/>
-              </w:rPr>
-              <w:t>expansión</w:t>
-            </w:r>
-            <w:r>
-              <w:t xml:space="preserve"> de </w:t>
-            </w:r>
-            <w:r>
-              <w:rPr>
-                <w:rFonts w:ascii="Consolas" w:hAnsi="Consolas"/>
-                <w:color w:val="6941A5"/>
-              </w:rPr>
-              <w:t>TA</w:t>
-            </w:r>
-            <w:r>
-              <w:t xml:space="preserve"> es tensión arterial. El </w:t>
-            </w:r>
-            <w:r>
-              <w:rPr>
-                <w:b/>
-              </w:rPr>
-              <w:t>hallazgo clínico</w:t>
-            </w:r>
-            <w:r>
-              <w:t xml:space="preserve"> expresado por </w:t>
-            </w:r>
-            <w:r>
-              <w:rPr>
-                <w:rFonts w:ascii="Consolas" w:hAnsi="Consolas"/>
-                <w:color w:val="6941A5"/>
-              </w:rPr>
-              <w:t>TA 150/90 mmHg</w:t>
-            </w:r>
-            <w:r>
-              <w:t xml:space="preserve"> es hipertensión arterial según el criterio establecido por este protocolo. Son dos decisiones relacionadas, pero se registran por separado.</w:t>
+              <w:t>No confundir expansión con concepto. La expansión de TA es tensión arterial. La mención registra el dato y el valor documentados. No se infiere hipertensión arterial si la nota no lo afirma de manera explícita; son decisiones relacionadas y pueden conservarse en una misma marca cuando corresponda.</w:t>
             </w:r>
           </w:p>
         </w:tc>
@@ -1714,7 +1637,7 @@
     </w:p>
     <w:p>
       <w:r>
-        <w:t>Este manual se aplica a las notas que recibirá para anotar. Su tarea es revisar cada nota completa, agregar lo que falte, dejar una decisión clara para cada forma breve y cada concepto clínico y, en caso de recibir devoluciones del investigador principal, corregir los puntos señalados.</w:t>
+        <w:t>Este manual se aplica a las notas que recibirá para anotar. Su tarea es revisar cada nota completa, agregar lo que falte, clasificar cada marca y completar las dimensiones que correspondan. En caso de recibir devoluciones del investigador principal, corrija los puntos señalados.</w:t>
       </w:r>
     </w:p>
     <w:tbl>
@@ -1799,13 +1722,7 @@
         </w:numPr>
       </w:pPr>
       <w:r>
-        <w:rPr>
-          <w:b/>
-        </w:rPr>
-        <w:t>Primero, encuentre las formas breves.</w:t>
-      </w:r>
-      <w:r>
-        <w:t xml:space="preserve"> Revise las sugeridas por la aplicación y agregue las que falten.</w:t>
+        <w:t>Lea la nota completa. La especialidad sospechada es una pista general; la ubicación de cada aparición se decide por la sección local.</w:t>
       </w:r>
     </w:p>
     <w:p>
@@ -1817,13 +1734,7 @@
         </w:numPr>
       </w:pPr>
       <w:r>
-        <w:rPr>
-          <w:b/>
-        </w:rPr>
-        <w:t>Después, decida qué significa cada forma breve.</w:t>
-      </w:r>
-      <w:r>
-        <w:t xml:space="preserve"> Use la sección, las palabras cercanas y el resto de la nota.</w:t>
+        <w:t>Marque los pendientes. Revise los premarcados, ajuste límites y agregue cada mención que falte con “Marcar para revisar”.</w:t>
       </w:r>
     </w:p>
     <w:p>
@@ -1835,13 +1746,7 @@
         </w:numPr>
       </w:pPr>
       <w:r>
-        <w:rPr>
-          <w:b/>
-        </w:rPr>
-        <w:t>Luego, encuentre los conceptos clínicos.</w:t>
-      </w:r>
-      <w:r>
-        <w:t xml:space="preserve"> Revise los candidatos y agregue las menciones clínicas omitidas.</w:t>
+        <w:t>Cierre la marcación. Pulse “Terminé la marcación · ver pendientes” para abrir la secuencia de decisiones.</w:t>
       </w:r>
     </w:p>
     <w:p>
@@ -1853,13 +1758,7 @@
         </w:numPr>
       </w:pPr>
       <w:r>
-        <w:rPr>
-          <w:b/>
-        </w:rPr>
-        <w:t>Revise cada concepto clínico.</w:t>
-      </w:r>
-      <w:r>
-        <w:t xml:space="preserve"> Delimite la mención, elija la categoría y normalice lo expresado por la nota.</w:t>
+        <w:t>Clasifique cada aparición. Elija término con información clínica, término sin información clínica, ambos o no anotar. Complete las dimensiones que correspondan sin volver a marcar el mismo texto.</w:t>
       </w:r>
     </w:p>
     <w:p>
@@ -1871,13 +1770,7 @@
         </w:numPr>
       </w:pPr>
       <w:r>
-        <w:rPr>
-          <w:b/>
-        </w:rPr>
-        <w:t>Al final, compruebe la nota completa.</w:t>
-      </w:r>
-      <w:r>
-        <w:t xml:space="preserve"> Verifique que no queden omisiones ni campos obligatorios pendientes.</w:t>
+        <w:t>Finalice y exporte. Verifique que no queden decisiones ni campos obligatorios pendientes y descargue el JSON desde la interfaz.</w:t>
       </w:r>
     </w:p>
     <w:tbl>
@@ -2177,13 +2070,7 @@
         </w:numPr>
       </w:pPr>
       <w:r>
-        <w:rPr>
-          <w:b/>
-        </w:rPr>
-        <w:t>Lea la nota completa.</w:t>
-      </w:r>
-      <w:r>
-        <w:t xml:space="preserve"> Reconozca su estructura antes de decidir una sigla aislada.</w:t>
+        <w:t>Lea la nota completa. Hágalo antes de decidir una sigla o aceptar un premarcado.</w:t>
       </w:r>
     </w:p>
     <w:p>
@@ -2195,13 +2082,7 @@
         </w:numPr>
       </w:pPr>
       <w:r>
-        <w:rPr>
-          <w:b/>
-        </w:rPr>
-        <w:t>Revise las formas breves.</w:t>
-      </w:r>
-      <w:r>
-        <w:t xml:space="preserve"> Complete una decisión para cada candidato léxico.</w:t>
+        <w:t>Marque las menciones pendientes. Seleccione el texto exacto y use “Marcar para revisar”.</w:t>
       </w:r>
     </w:p>
     <w:p>
@@ -2213,13 +2094,7 @@
         </w:numPr>
       </w:pPr>
       <w:r>
-        <w:rPr>
-          <w:b/>
-        </w:rPr>
-        <w:t>Agregue omisiones léxicas.</w:t>
-      </w:r>
-      <w:r>
-        <w:t xml:space="preserve"> Incluya abreviaturas, siglas, códigos y encabezados no detectados.</w:t>
+        <w:t>Incluya las omisiones. Agregue toda mención clínica o forma breve que no haya sido señalada.</w:t>
       </w:r>
     </w:p>
     <w:p>
@@ -2231,13 +2106,7 @@
         </w:numPr>
       </w:pPr>
       <w:r>
-        <w:rPr>
-          <w:b/>
-        </w:rPr>
-        <w:t>Resuelva cada forma breve.</w:t>
-      </w:r>
-      <w:r>
-        <w:t xml:space="preserve"> Determine su tipo, significado, función, sección y pistas.</w:t>
+        <w:t>Termine la marcación. Pulse “Terminé la marcación · ver pendientes” para abrir el flujo secuencial.</w:t>
       </w:r>
     </w:p>
     <w:p>
@@ -2249,13 +2118,7 @@
         </w:numPr>
       </w:pPr>
       <w:r>
-        <w:rPr>
-          <w:b/>
-        </w:rPr>
-        <w:t>Revise las sugerencias clínicas.</w:t>
-      </w:r>
-      <w:r>
-        <w:t xml:space="preserve"> Acepte, corrija los límites o descarte cada candidato.</w:t>
+        <w:t>Clasifique cada marca. Elija término con información clínica, término sin información clínica, ambos o no anotar.</w:t>
       </w:r>
     </w:p>
     <w:p>
@@ -2267,13 +2130,7 @@
         </w:numPr>
       </w:pPr>
       <w:r>
-        <w:rPr>
-          <w:b/>
-        </w:rPr>
-        <w:t>Agregue omisiones clínicas.</w:t>
-      </w:r>
-      <w:r>
-        <w:t xml:space="preserve"> Marque manualmente todo concepto elegible que falte.</w:t>
+        <w:t>Complete la dimensión correspondiente. Abra la codificación clínica, la tarjeta léxica o ambas, sin volver a marcar la aparición.</w:t>
       </w:r>
     </w:p>
     <w:p>
@@ -2285,13 +2142,7 @@
         </w:numPr>
       </w:pPr>
       <w:r>
-        <w:rPr>
-          <w:b/>
-        </w:rPr>
-        <w:t>Revise la doble capa.</w:t>
-      </w:r>
-      <w:r>
-        <w:t xml:space="preserve"> Compruebe si alguna forma breve también integra una mención clínica.</w:t>
+        <w:t>Use “Ambos” cuando corresponda. Una misma marca puede conservar información clínica y significado local.</w:t>
       </w:r>
     </w:p>
     <w:p>
@@ -2303,13 +2154,7 @@
         </w:numPr>
       </w:pPr>
       <w:r>
-        <w:rPr>
-          <w:b/>
-        </w:rPr>
-        <w:t>Normalice los conceptos clínicos.</w:t>
-      </w:r>
-      <w:r>
-        <w:t xml:space="preserve"> Elija categoría, concepto y atributos sin agregar inferencias no previstas por el protocolo.</w:t>
+        <w:t>Normalice la información clínica. Elija categoría, concepto y atributos sin agregar inferencias no previstas por el protocolo.</w:t>
       </w:r>
     </w:p>
     <w:p>
@@ -2321,13 +2166,7 @@
         </w:numPr>
       </w:pPr>
       <w:r>
-        <w:rPr>
-          <w:b/>
-        </w:rPr>
-        <w:t>Cierre y exporte.</w:t>
-      </w:r>
-      <w:r>
-        <w:t xml:space="preserve"> Finalice solo después de los controles de calidad.</w:t>
+        <w:t>Cierre y exporte. Finalice solo después de completar la secuencia y los controles de calidad.</w:t>
       </w:r>
     </w:p>
     <w:tbl>
@@ -2472,13 +2311,7 @@
         <w:pStyle w:val="Listaconvietas"/>
       </w:pPr>
       <w:r>
-        <w:rPr>
-          <w:b/>
-        </w:rPr>
-        <w:t>Incorporar mención omitida:</w:t>
-      </w:r>
-      <w:r>
-        <w:t xml:space="preserve"> use este botón cuando el fragmento expresa un concepto clínico elegible de alguna de las tres jerarquías: hallazgo clínico, procedimiento o fármaco.</w:t>
+        <w:t>Marcar para revisar: use este botón después de seleccionar el tramo exacto. La marca entrará en la secuencia de decisión al terminar la marcación de la nota.</w:t>
       </w:r>
     </w:p>
     <w:p>
@@ -2486,13 +2319,7 @@
         <w:pStyle w:val="Listaconvietas"/>
       </w:pPr>
       <w:r>
-        <w:rPr>
-          <w:b/>
-        </w:rPr>
-        <w:t>Incorporar forma breve:</w:t>
-      </w:r>
-      <w:r>
-        <w:t xml:space="preserve"> use este botón cuando el fragmento seleccionado es una abreviatura, sigla, código u otra forma breve que no había sido detectada.</w:t>
+        <w:t>Clasificación unificada: para cada marca elija término con información clínica, término sin información clínica, ambos o no anotar. No cree una segunda marca para la misma aparición.</w:t>
       </w:r>
     </w:p>
     <w:p>
@@ -2500,21 +2327,12 @@
         <w:pStyle w:val="Listaconvietas"/>
       </w:pPr>
       <w:r>
-        <w:t>Una misma expresión puede requerir revisión en las dos capas. En ese caso, registre por separado la forma breve y la mención clínica.</w:t>
-      </w:r>
-    </w:p>
-    <w:p>
-      <w:r>
-        <w:t xml:space="preserve">El nombre visible del segundo botón es </w:t>
-      </w:r>
-      <w:r>
-        <w:rPr>
-          <w:b/>
-        </w:rPr>
-        <w:t>Incorporar forma breve</w:t>
-      </w:r>
-      <w:r>
-        <w:t>. No agrega un comentario libre: incorpora el fragmento seleccionado a la capa léxica para que después pueda completar su significado.</w:t>
+        <w:t>Una misma expresión puede requerir las dos dimensiones. En ese caso, elija “Ambos” y complete la información clínica y el significado local en la misma marca.</w:t>
+      </w:r>
+    </w:p>
+    <w:p>
+      <w:r>
+        <w:t>La interfaz web no separa botones para “mención omitida” y “forma breve”. La selección se incorpora con “Marcar para revisar” y se clasifica después, cuando la marcación de la nota ya está cerrada.</w:t>
       </w:r>
     </w:p>
     <w:p>
@@ -2569,12 +2387,7 @@
         <w:jc w:val="center"/>
       </w:pPr>
       <w:r>
-        <w:rPr>
-          <w:i/>
-          <w:color w:val="5D6875"/>
-          <w:sz w:val="18"/>
-        </w:rPr>
-        <w:t>Figura 5. `capilaroscopia` es una sugerencia premarcada que debe revisarse. `caídas` fue seleccionada por el anotador y puede incorporarse como mención clínica omitida. Si el texto seleccionado fuera una abreviatura o sigla omitida, se usaría Incorporar forma breve.</w:t>
+        <w:t>Figura 5. Una sugerencia premarcada y una selección manual se revisan desde la nota. La versión actual usa “Marcar para revisar” y luego abre una secuencia unificada de decisión.</w:t>
       </w:r>
     </w:p>
     <w:tbl>
@@ -4858,7 +4671,7 @@
     </w:p>
     <w:p>
       <w:r>
-        <w:t>Después de resolver la forma breve, pregunte si el fragmento expresa un concepto clínico que debe normalizarse. Trabaje con lo que la nota afirma; no complete información por conocimiento médico.</w:t>
+        <w:t>Cuando una marca se clasifica como término con información clínica o como “Ambos”, abra su codificación y decida si puede asociarse a un concepto clínico. Trabaje con lo que la nota afirma; no complete información por conocimiento médico. Un término puede tener información clínica aun cuando el concepto SNOMED CT quede pendiente de codificación.</w:t>
       </w:r>
     </w:p>
     <w:p>
@@ -5837,24 +5650,7 @@
               <w:keepLines/>
             </w:pPr>
             <w:r>
-              <w:rPr>
-                <w:b/>
-                <w:color w:val="9B5C00"/>
-              </w:rPr>
-              <w:t xml:space="preserve">Aplicar únicamente las interpretaciones previstas. </w:t>
-            </w:r>
-            <w:r>
-              <w:t xml:space="preserve">Use una interpretación derivada de un valor solo cuando el protocolo la haya definido. En este manual, </w:t>
-            </w:r>
-            <w:r>
-              <w:rPr>
-                <w:rFonts w:ascii="Consolas" w:hAnsi="Consolas"/>
-                <w:color w:val="6941A5"/>
-              </w:rPr>
-              <w:t>TA 150/90 mmHg</w:t>
-            </w:r>
-            <w:r>
-              <w:t xml:space="preserve"> se interpreta como hipertensión arterial y se registra como hallazgo clínico. Fuera de una regla explícita, no agregue diagnósticos por conocimiento médico.</w:t>
+              <w:t>Aplicar únicamente las interpretaciones previstas. Use una interpretación derivada de un valor solo cuando el protocolo la haya definido. En este manual, TA 150/90 mmHg registra tensión arterial y el valor documentado; no se interpreta como hipertensión si la nota no lo afirma de manera explícita. Fuera de una regla explícita, no agregue diagnósticos por conocimiento médico.</w:t>
             </w:r>
           </w:p>
         </w:tc>
@@ -6593,13 +6389,7 @@
         </w:numPr>
       </w:pPr>
       <w:r>
-        <w:rPr>
-          <w:b/>
-        </w:rPr>
-        <w:t>Evalúe después la capa clínica.</w:t>
-      </w:r>
-      <w:r>
-        <w:t xml:space="preserve"> Los encabezados no son conceptos; las palabras completas y las expresiones clínicas se revisan por separado.</w:t>
+        <w:t>Clasifique la marca. Los encabezados no son conceptos; las palabras completas y las expresiones clínicas se revisan según la opción elegida y el contexto.</w:t>
       </w:r>
     </w:p>
     <w:p>
@@ -7861,21 +7651,7 @@
         <w:ind w:left="540" w:hanging="271"/>
       </w:pPr>
       <w:r>
-        <w:rPr>
-          <w:b/>
-          <w:color w:val="6941A5"/>
-        </w:rPr>
-        <w:t>☐</w:t>
-      </w:r>
-      <w:r>
-        <w:rPr>
-          <w:b/>
-          <w:color w:val="6941A5"/>
-        </w:rPr>
-        <w:t xml:space="preserve"> </w:t>
-      </w:r>
-      <w:r>
-        <w:t>Las menciones de doble capa conservan ambas anotaciones cuando corresponde.</w:t>
+        <w:t>☐ Las marcas clasificadas como “Ambos” conservan la información clínica y el significado local cuando corresponde.</w:t>
       </w:r>
     </w:p>
     <w:p>
@@ -8680,7 +8456,7 @@
               <w:pStyle w:val="TableText"/>
             </w:pPr>
             <w:r>
-              <w:t>6. Doble capa</w:t>
+              <w:t>6. Ambos</w:t>
             </w:r>
           </w:p>
         </w:tc>
@@ -8694,7 +8470,7 @@
               <w:pStyle w:val="TableText"/>
             </w:pPr>
             <w:r>
-              <w:t>¿Alguna forma breve integra un concepto clínico?</w:t>
+              <w:t>¿La marca tiene información clínica y significado local?</w:t>
             </w:r>
           </w:p>
         </w:tc>
@@ -8708,7 +8484,7 @@
               <w:pStyle w:val="TableText"/>
             </w:pPr>
             <w:r>
-              <w:t>Dos anotaciones cuando corresponda.</w:t>
+              <w:t>Dos dimensiones en la misma marca.</w:t>
             </w:r>
           </w:p>
         </w:tc>

</xml_diff>

<commit_message>
feat: flujo unificado v2 con 4 opciones simetricas, capa lexica y ejemplo JSON
- Paso 3 con 4 opciones simetricas uniformes en todas las menciones:
  Solo informacion clinica / Solo abreviatura contextual /
  Informacion clinica + abreviatura contextual / Sin valor (Anular)
- Modelo de anotacion actualizado (annotation.model.ts)
- Componente anotador revisado: logica de decisiones, SNOMED CT,
  formularios lexicos y finalizacion de nota
- Estilos CSS actualizados (annotator.component.css, styles.css)
- Nuevo ejemplo publico: public/example-input.json
  (caso CELDA_24 PAIR_0024 AMBULATORIO con 18 menciones)
- Docs: Manual base spans v2, Contrato capa lexica v2,
  Manual practico App web y Android, Manual consolidado v2.2
- Tools: build_consolidated_manuals.py actualizado
</commit_message>
<xml_diff>
--- a/docs/Manual_base_spans.docx
+++ b/docs/Manual_base_spans.docx
@@ -2058,115 +2058,18 @@
         <w:pStyle w:val="Ttulo2"/>
       </w:pPr>
       <w:r>
-        <w:t>4.2 Orden recomendado</w:t>
-      </w:r>
-    </w:p>
-    <w:p>
-      <w:pPr>
-        <w:pStyle w:val="Listaconnmeros"/>
+        <w:t>4.2 Controles durante la revisión</w:t>
+      </w:r>
+    </w:p>
+    <w:p>
+      <w:pPr>
         <w:numPr>
           <w:ilvl w:val="0"/>
           <w:numId w:val="12"/>
         </w:numPr>
       </w:pPr>
       <w:r>
-        <w:t>Lea la nota completa. Hágalo antes de decidir una sigla o aceptar un premarcado.</w:t>
-      </w:r>
-    </w:p>
-    <w:p>
-      <w:pPr>
-        <w:pStyle w:val="Listaconnmeros"/>
-        <w:numPr>
-          <w:ilvl w:val="0"/>
-          <w:numId w:val="12"/>
-        </w:numPr>
-      </w:pPr>
-      <w:r>
-        <w:t>Marque las menciones pendientes. Seleccione el texto exacto y use “Marcar para revisar”.</w:t>
-      </w:r>
-    </w:p>
-    <w:p>
-      <w:pPr>
-        <w:pStyle w:val="Listaconnmeros"/>
-        <w:numPr>
-          <w:ilvl w:val="0"/>
-          <w:numId w:val="12"/>
-        </w:numPr>
-      </w:pPr>
-      <w:r>
-        <w:t>Incluya las omisiones. Agregue toda mención clínica o forma breve que no haya sido señalada.</w:t>
-      </w:r>
-    </w:p>
-    <w:p>
-      <w:pPr>
-        <w:pStyle w:val="Listaconnmeros"/>
-        <w:numPr>
-          <w:ilvl w:val="0"/>
-          <w:numId w:val="12"/>
-        </w:numPr>
-      </w:pPr>
-      <w:r>
-        <w:t>Termine la marcación. Pulse “Terminé la marcación · ver pendientes” para abrir el flujo secuencial.</w:t>
-      </w:r>
-    </w:p>
-    <w:p>
-      <w:pPr>
-        <w:pStyle w:val="Listaconnmeros"/>
-        <w:numPr>
-          <w:ilvl w:val="0"/>
-          <w:numId w:val="12"/>
-        </w:numPr>
-      </w:pPr>
-      <w:r>
-        <w:t>Clasifique cada marca. Elija término con información clínica, término sin información clínica, ambos o no anotar.</w:t>
-      </w:r>
-    </w:p>
-    <w:p>
-      <w:pPr>
-        <w:pStyle w:val="Listaconnmeros"/>
-        <w:numPr>
-          <w:ilvl w:val="0"/>
-          <w:numId w:val="12"/>
-        </w:numPr>
-      </w:pPr>
-      <w:r>
-        <w:t>Complete la dimensión correspondiente. Abra la codificación clínica, la tarjeta léxica o ambas, sin volver a marcar la aparición.</w:t>
-      </w:r>
-    </w:p>
-    <w:p>
-      <w:pPr>
-        <w:pStyle w:val="Listaconnmeros"/>
-        <w:numPr>
-          <w:ilvl w:val="0"/>
-          <w:numId w:val="12"/>
-        </w:numPr>
-      </w:pPr>
-      <w:r>
-        <w:t>Use “Ambos” cuando corresponda. Una misma marca puede conservar información clínica y significado local.</w:t>
-      </w:r>
-    </w:p>
-    <w:p>
-      <w:pPr>
-        <w:pStyle w:val="Listaconnmeros"/>
-        <w:numPr>
-          <w:ilvl w:val="0"/>
-          <w:numId w:val="12"/>
-        </w:numPr>
-      </w:pPr>
-      <w:r>
-        <w:t>Normalice la información clínica. Elija categoría, concepto y atributos sin agregar inferencias no previstas por el protocolo.</w:t>
-      </w:r>
-    </w:p>
-    <w:p>
-      <w:pPr>
-        <w:pStyle w:val="Listaconnmeros"/>
-        <w:numPr>
-          <w:ilvl w:val="0"/>
-          <w:numId w:val="12"/>
-        </w:numPr>
-      </w:pPr>
-      <w:r>
-        <w:t>Cierre y exporte. Finalice solo después de completar la secuencia y los controles de calidad.</w:t>
+        <w:t>Siga el flujo de la sección 3.1. Mantenga la nota visible, confirme cada límite y avance de forma secuencial. No cree una segunda marca: use “Ambos” cuando corresponda.</w:t>
       </w:r>
     </w:p>
     <w:tbl>
@@ -2235,106 +2138,21 @@
     </w:p>
     <w:p>
       <w:r>
-        <w:t xml:space="preserve">Una </w:t>
-      </w:r>
-      <w:r>
-        <w:rPr>
-          <w:b/>
-        </w:rPr>
-        <w:t>mención premarcada</w:t>
-      </w:r>
-      <w:r>
-        <w:t xml:space="preserve"> es un fragmento que la aplicación señaló para que usted lo revise. En la figura, </w:t>
-      </w:r>
-      <w:r>
-        <w:rPr>
-          <w:rFonts w:ascii="Consolas" w:hAnsi="Consolas"/>
-          <w:color w:val="6941A5"/>
-          <w:sz w:val="18"/>
-        </w:rPr>
-        <w:t>capilaroscopia</w:t>
-      </w:r>
-      <w:r>
-        <w:t xml:space="preserve"> aparece en verde. El color indica </w:t>
-      </w:r>
-      <w:r>
-        <w:rPr>
-          <w:b/>
-        </w:rPr>
-        <w:t>dónde mirar</w:t>
-      </w:r>
-      <w:r>
-        <w:t>; no confirma que la selección sea correcta, que sus límites sean exactos ni que deba aceptar un concepto determinado.</w:t>
-      </w:r>
-    </w:p>
-    <w:p>
-      <w:pPr>
-        <w:pStyle w:val="Listaconvietas"/>
-      </w:pPr>
-      <w:r>
-        <w:rPr>
-          <w:b/>
-        </w:rPr>
-        <w:t>Premarcado en verde:</w:t>
-      </w:r>
-      <w:r>
-        <w:t xml:space="preserve"> revise la mención, confirme si corresponde, ajuste sus límites si están mal o descártela si es irrelevante.</w:t>
-      </w:r>
-    </w:p>
-    <w:p>
-      <w:pPr>
-        <w:pStyle w:val="Listaconvietas"/>
-      </w:pPr>
-      <w:r>
-        <w:rPr>
-          <w:b/>
-        </w:rPr>
-        <w:t>Selección hecha por usted:</w:t>
-      </w:r>
-      <w:r>
-        <w:t xml:space="preserve"> arrastre el cursor sobre el texto omitido. En la figura, </w:t>
-      </w:r>
-      <w:r>
-        <w:rPr>
-          <w:rFonts w:ascii="Consolas" w:hAnsi="Consolas"/>
-          <w:color w:val="6941A5"/>
-          <w:sz w:val="18"/>
-        </w:rPr>
-        <w:t>caídas</w:t>
-      </w:r>
-      <w:r>
-        <w:t xml:space="preserve"> está seleccionado en azul.</w:t>
-      </w:r>
-    </w:p>
-    <w:p>
-      <w:pPr>
-        <w:pStyle w:val="Listaconvietas"/>
-      </w:pPr>
-      <w:r>
-        <w:t>Marcar para revisar: use este botón después de seleccionar el tramo exacto. La marca entrará en la secuencia de decisión al terminar la marcación de la nota.</w:t>
-      </w:r>
-    </w:p>
-    <w:p>
-      <w:pPr>
-        <w:pStyle w:val="Listaconvietas"/>
-      </w:pPr>
-      <w:r>
-        <w:t>Clasificación unificada: para cada marca elija término con información clínica, término sin información clínica, ambos o no anotar. No cree una segunda marca para la misma aparición.</w:t>
-      </w:r>
-    </w:p>
-    <w:p>
-      <w:pPr>
-        <w:pStyle w:val="Listaconvietas"/>
-      </w:pPr>
-      <w:r>
-        <w:t>Una misma expresión puede requerir las dos dimensiones. En ese caso, elija “Ambos” y complete la información clínica y el significado local en la misma marca.</w:t>
-      </w:r>
-    </w:p>
-    <w:p>
-      <w:r>
-        <w:t>La interfaz web no separa botones para “mención omitida” y “forma breve”. La selección se incorpora con “Marcar para revisar” y se clasifica después, cuando la marcación de la nota ya está cerrada.</w:t>
-      </w:r>
-    </w:p>
+        <w:t>Los resaltados son candidatos: la aplicación los señala para que usted los revise, pero no confirma los límites ni el concepto. En la figura, capilaroscopia aparece en verde. Confirme o ajuste cada selección y descarte lo irrelevante. Para agregar una mención, seleccione el tramo exacto y pulse “Marcar para revisar”; la clasificación se realiza después de cerrar la marcación. Siga el orden básico de trabajo y use una sola marca por aparición: elija “Ambos” cuando la misma expresión tenga dimensión clínica y léxica.</w:t>
+      </w:r>
+    </w:p>
+    <CT_P>
+      <w:pPr/>
+      <w:r>
+        <w:t>Los resaltados son candidatos, no respuestas. Confirme o ajuste sus límites y descarte lo irrelevante. Para agregar una mención, seleccione el tramo exacto y pulse “Marcar para revisar”; la clasificación se realiza después de cerrar la marcación.</w:t>
+      </w:r>
+    </CT_P>
+    <CT_P>
+      <w:pPr/>
+      <w:r>
+        <w:t>Los resaltados son candidatos, no respuestas. Confirme o ajuste sus límites y descarte lo irrelevante. Para agregar una mención, seleccione el tramo exacto y pulse “Marcar para revisar”; la clasificación se realiza después de cerrar la marcación.</w:t>
+      </w:r>
+    </CT_P>
     <w:p>
       <w:pPr>
         <w:keepNext/>
@@ -5760,13 +5578,7 @@
         <w:pStyle w:val="Listaconvietas"/>
       </w:pPr>
       <w:r>
-        <w:rPr>
-          <w:b/>
-        </w:rPr>
-        <w:t>Capa clínica:</w:t>
-      </w:r>
-      <w:r>
-        <w:t xml:space="preserve"> registre hipertensión arterial como hallazgo clínico, de acuerdo con el criterio de interpretación establecido por este protocolo.</w:t>
+        <w:t>Capa clínica: registre la mención como tensión arterial y conserve el valor documentado. No la convierta en hipertensión arterial si la nota no lo afirma de manera explícita.</w:t>
       </w:r>
     </w:p>
     <w:p>

</xml_diff>